<commit_message>
Epidemiologiya: 028-030 + aniq SanQvaM havolalari va iqtiboslar (009,013,014,020,023,024)
</commit_message>
<xml_diff>
--- a/javoblar/009.docx
+++ b/javoblar/009.docx
@@ -35,7 +35,7 @@
         <w:jc w:val="both"/>
       </w:pPr>
       <w:r>
-        <w:t xml:space="preserve">Profilaktik dezinfeksiya aniq infeksiya manbai yo'q bo'lgan, biroq uning paydo bo'lishi va qo'zg'atuvchining to'planishi ehtimoli mavjud joylarda muntazam o'tkaziladi. Uning maqsadi — kasallik qo'zg'atuvchilarining tashqi muhitda to'planishi va tarqalishining oldini olishdir. U jamoat joylarida — kasalxonalar, poliklinikalar, maktablar va bog'chalar, umumiy ovqatlanish shoxobchalari, suv ta'minoti inshootlari, vokzallar va transportda amalga oshiriladi. Misollar: ichimlik suvini xlorlash, chiqindi suvlarni zararsizlantirish, umumiy ovqatlanish idishlarini qaynatish, qo'llarni dezinfeksiyalash. Profilaktik dezinfeksiya doimiy, rejali xususiyatga ega bo'lib, u epidemik vaziyatdan qat'i nazar, sanitariya qoidalariga muvofiq muntazam o'tkaziladi va aholi salomatligini himoya qilishning umumiy tizimiga kiradi [1][2].</w:t>
+        <w:t xml:space="preserve">Profilaktik dezinfeksiya aniq infeksiya manbai yo'q bo'lgan, biroq uning paydo bo'lishi va qo'zg'atuvchining to'planishi ehtimoli mavjud joylarda muntazam o'tkaziladi. Uning maqsadi — kasallik qo'zg'atuvchilarining tashqi muhitda to'planishi va tarqalishining oldini olishdir. U jamoat joylarida — kasalxonalar, poliklinikalar, maktablar va bog'chalar, umumiy ovqatlanish shoxobchalari, suv ta'minoti inshootlari, vokzallar va transportda amalga oshiriladi. Misollar: ichimlik suvini xlorlash, chiqindi suvlarni zararsizlantirish, umumiy ovqatlanish idishlarini qaynatish, qo'llarni dezinfeksiyalash. Profilaktik dezinfeksiya doimiy, rejali xususiyatga ega bo'lib, u epidemik vaziyatdan qat'i nazar, sanitariya qoidalariga muvofiq muntazam o'tkaziladi [1][2]. O'zbekistonda dezinfeksiya ishi O'zR SanQvaN 0090-25 bilan tartibga solinadi; bu hujjat aynan "dezinfeksiya tadbirlarini o'tkazish, dezinfeksiya xizmatini amalga oshiruvchi tashkilotlarni joylashtirish hamda ... dezinfeksiya vositalarini saqlash, tashish va ulardan foydalanishga oid" qoidalarni belgilaydi [2].</w:t>
       </w:r>
     </w:p>
     <w:p>
@@ -147,7 +147,7 @@
         <w:spacing w:after="40"/>
       </w:pPr>
       <w:r>
-        <w:t xml:space="preserve">V.L. Osipova. Dezinfeksiya. O'quv qo'llanma. — Moskva: GEOTAR-Media, 2009. (Manba: xayrullokomilov.uz kutubxonasi, ochiq manba.)</w:t>
+        <w:t xml:space="preserve">V.L. Osipova. Dezinfeksiya. O'quv qo'llanma. — Moskva: GEOTAR-Media, 2009. (Nusxa: xayrullokomilov.uz/kutubxona, ochiq manba.)</w:t>
       </w:r>
     </w:p>
     <w:p>
@@ -160,7 +160,7 @@
         <w:spacing w:after="40"/>
       </w:pPr>
       <w:r>
-        <w:t xml:space="preserve">Umumiy epidemiologiya. Oliy tibbiy ta'lim darsligi. — Toshkent: Tibbiyot nashriyoti. (Dezinfeksiya turlari va tartibi.)</w:t>
+        <w:t xml:space="preserve">O'zR SanQvaN 0090-25. Dezinfeksiya tadbirlarini o'tkazish, dezinfeksiya xizmatini amalga oshiruvchi tashkilotlarni joylashtirish hamda ularning xonalari va jihozlariga, dezinfeksiya vositalarini saqlash, tashish va ulardan foydalanishga oid sanitariya qoidalari, normalari va gigiyena normativlari. O'zR Adliya vazirligida 2025-yil 3-iyunda ro'yxatga olingan (hisob raqami 350). URL: https://lex.uz/docs/-7556121</w:t>
       </w:r>
     </w:p>
     <w:p>
@@ -173,7 +173,7 @@
         <w:spacing w:after="40"/>
       </w:pPr>
       <w:r>
-        <w:t xml:space="preserve">X. Komilov kutubxonasi materiallari (ochiq manba). URL: https://xayrullokomilov.uz/kutubxona</w:t>
+        <w:t xml:space="preserve">Umumiy epidemiologiya. Oliy tibbiy ta'lim muassasalari uchun darslik. — Toshkent: Tibbiyot nashriyoti.</w:t>
       </w:r>
     </w:p>
     <w:sectPr>

</xml_diff>

<commit_message>
009: aniq hujjat (SanQvaN 0090-25) asosida, ravon uslubda qayta yozildi
</commit_message>
<xml_diff>
--- a/javoblar/009.docx
+++ b/javoblar/009.docx
@@ -17,7 +17,7 @@
         <w:jc w:val="both"/>
       </w:pPr>
       <w:r>
-        <w:t xml:space="preserve">Dezinfeksiya — tashqi muhit obyektlarida yuqumli kasallik qo'zg'atuvchilarini yo'q qilishga qaratilgan tadbirlar majmui bo'lib, u epidemik jarayonning ikkinchi bo'g'iniga — qo'zg'atuvchining yuqish mexanizmiga ta'sir qiladi. Dezinfeksiya epidemiyaga qarshi kurashning muhim yo'nalishlaridan biri bo'lib, u ayniqsa tashqi muhit orqali yuqadigan infeksiyalarda (ichak infeksiyalari, nafas yo'llari infeksiyalari, shifoxona ichi infeksiyalari) hal qiluvchi ahamiyatga ega. O'tkazilish maqsadiga ko'ra dezinfeksiya profilaktik va o'choqdagi (joriy va yakuniy) turlarga bo'linadi [1][2].</w:t>
+        <w:t xml:space="preserve">Dezinfeksiya — tashqi muhit obyektlarida yuqumli va parazitar kasalliklar qo'zg'atuvchilarini yo'q qilishga qaratilgan tadbirlar majmui bo'lib, u epidemik jarayonning ikkinchi bo'g'iniga — qo'zg'atuvchining yuqish mexanizmiga ta'sir qiladi. O'zbekiston Respublikasida dezinfeksiya tadbirlarini o'tkazish tartibi, ularni amalga oshiruvchi tashkilotlar va vositalarga qo'yiladigan talablar SanQvaN 0090-25 bilan belgilangan [1]. Maqsadiga ko'ra dezinfeksiya profilaktik va o'choqdagi turlarga, o'choqdagi dezinfeksiya esa joriy va yakuniy (o'choqli) turlarga bo'linadi [1].</w:t>
       </w:r>
     </w:p>
     <w:p>
@@ -35,7 +35,7 @@
         <w:jc w:val="both"/>
       </w:pPr>
       <w:r>
-        <w:t xml:space="preserve">Profilaktik dezinfeksiya aniq infeksiya manbai yo'q bo'lgan, biroq uning paydo bo'lishi va qo'zg'atuvchining to'planishi ehtimoli mavjud joylarda muntazam o'tkaziladi. Uning maqsadi — kasallik qo'zg'atuvchilarining tashqi muhitda to'planishi va tarqalishining oldini olishdir. U jamoat joylarida — kasalxonalar, poliklinikalar, maktablar va bog'chalar, umumiy ovqatlanish shoxobchalari, suv ta'minoti inshootlari, vokzallar va transportda amalga oshiriladi. Misollar: ichimlik suvini xlorlash, chiqindi suvlarni zararsizlantirish, umumiy ovqatlanish idishlarini qaynatish, qo'llarni dezinfeksiyalash. Profilaktik dezinfeksiya doimiy, rejali xususiyatga ega bo'lib, u epidemik vaziyatdan qat'i nazar, sanitariya qoidalariga muvofiq muntazam o'tkaziladi [1][2]. O'zbekistonda dezinfeksiya ishi O'zR SanQvaN 0090-25 bilan tartibga solinadi; bu hujjat aynan "dezinfeksiya tadbirlarini o'tkazish, dezinfeksiya xizmatini amalga oshiruvchi tashkilotlarni joylashtirish hamda ... dezinfeksiya vositalarini saqlash, tashish va ulardan foydalanishga oid" qoidalarni belgilaydi [2].</w:t>
+        <w:t xml:space="preserve">Profilaktik dezinfeksiya epidemik vaziyatdan qat'i nazar, yuqumli va parazitar kasalliklarning oldini olish maqsadida doimiy ravishda o'tkaziladigan tadbirlar majmuidir [1]. U infeksiya manbai aniqlangan-aniqlanmaganidan qat'i nazar, qo'zg'atuvchi to'planishi va yuqishi ehtimoli bo'lgan joylarda — jamoat binolari, tibbiyot muassasalari, suv ta'minoti va umumiy ovqatlanish obyektlarida amalga oshiriladi. Profilaktik dezinfeksiya obyektlarda odatda oyda bir marta o'tkaziladi, epidemik kasalliklar mavsumida esa uning davriyligi oshiriladi [1]. Tadbir o'tkaziladigan obyekt xodimlari bu haqda bir kun oldin ogohlantirilishi talab etiladi [1].</w:t>
       </w:r>
     </w:p>
     <w:p>
@@ -44,7 +44,7 @@
         <w:spacing w:after="80" w:before="160"/>
       </w:pPr>
       <w:r>
-        <w:t xml:space="preserve">O'choqdagi dezinfeksiya: joriy dezinfeksiya</w:t>
+        <w:t xml:space="preserve">Joriy dezinfeksiya</w:t>
       </w:r>
     </w:p>
     <w:p>
@@ -53,7 +53,7 @@
         <w:jc w:val="both"/>
       </w:pPr>
       <w:r>
-        <w:t xml:space="preserve">O'choqdagi dezinfeksiya infeksiya manbai aniqlangan joyda o'tkaziladi va ikki turga bo'linadi: joriy va yakuniy. Joriy dezinfeksiya bemor atrofida, u infeksiya manbai bo'lib turgan davrda muntazam o'tkaziladi — ya'ni bemor uyda yoki kasalxonada bo'lganda, qo'zg'atuvchi ajralib turgan vaqtda. Uning maqsadi — qo'zg'atuvchini ajralib chiqqan zahoti yo'q qilib, atrofga tarqalishiga yo'l qo'ymaslikdir. Joriy dezinfeksiya bemorning ajralmalari (najas, siydik, qusuq, balg'am), idish-tovoqlari, kiyim-kechagi, to'shak anjomlari, parvarish buyumlari va xonani zararsizlantirishni o'z ichiga oladi. Uni ko'pincha bemorni parvarish qiluvchi shaxslar yoki tibbiy xodimlar bajaradi va buning uchun ularga oddiy dezinfeksiya usullari oldindan o'rgatiladi [1]. Joriy dezinfeksiyaning muvaffaqiyati uning uzluksizligiga bog'liq: har bir ajralma chiqarilgandan so'ng darhol zararsizlantirilishi, bemor idish-tovog'i alohida saqlanishi va har gal ishlatilgach dezinfeksiyalanishi lozim. Shifoxona sharoitida joriy dezinfeksiya sanitariya-gigiyenik rejim va infeksion nazoratning ajralmas qismi bo'lib, u shifoxona ichi infeksiyalarining oldini olishda markaziy o'rin tutadi. Bu davrda dezinfeksiya qo'zg'atuvchining atrofdagilarga, tibbiy xodimlarga va boshqa bemorlarga yuqishining oldini oladi.</w:t>
+        <w:t xml:space="preserve">Joriy dezinfeksiya epidemiologik ahamiyatga ega tashkilot va muassasalarda infeksiya tarqalishining oldini olish uchun muntazam yoki doimiy olib boriladigan tadbirlardir [1]. U infeksiya manbai (bemor) mavjud bo'lgan va u atrofga qo'zg'atuvchi ajratib turgan davrda o'tkaziladi. Uning maqsadi — qo'zg'atuvchini ajralib chiqqan zahoti yo'q qilib, atrofga tarqalishiga yo'l qo'ymaslikdir. Uy sharoitida yuqumli kasallik o'chog'i aniqlanganda bemorni boshqa oila a'zolaridan ajratish, xonani har kuni shamollatish, bemorning shaxsiy buyumlarini alohidalash hamda qo'l tegadigan barcha yuzalarni (to'shak, stol, stul, eshik tutqichlari) muntazam zararsizlantirish talab etiladi [1]. Joriy dezinfeksiya bemorning ajralmalari, idish-tovoqlari va kiyim-kechagini ham qamrab oladi [2]. Joriy dezinfeksiyani ko'pincha bemorni parvarish qiluvchi shaxslar yoki tibbiy xodimlar bajargani uchun ularga oddiy va xavfsiz usullar oldindan o'rgatiladi; shifoxona sharoitida esa u sanitariya-gigiyenik rejim va infeksion nazoratning ajralmas qismi bo'lib, yuqumli kasalliklar bo'limida qat'iy jadval asosida olib boriladi [2]. Joriy dezinfeksiyaning uzluksizligi uning samaradorligining asosiy shartidir.</w:t>
       </w:r>
     </w:p>
     <w:p>
@@ -62,7 +62,7 @@
         <w:spacing w:after="80" w:before="160"/>
       </w:pPr>
       <w:r>
-        <w:t xml:space="preserve">O'choqdagi dezinfeksiya: yakuniy dezinfeksiya</w:t>
+        <w:t xml:space="preserve">Yakuniy (o'choqli) dezinfeksiya</w:t>
       </w:r>
     </w:p>
     <w:p>
@@ -71,7 +71,7 @@
         <w:jc w:val="both"/>
       </w:pPr>
       <w:r>
-        <w:t xml:space="preserve">Yakuniy dezinfeksiya infeksiya manbai o'choqdan olib chiqilgach — bemor kasalxonaga yotqizilgandan, sog'aygandan, boshqa joyga ko'chirilgandan yoki vafot etgandan so'ng bir marta o'tkaziladi. Uning maqsadi — o'choqda qolgan barcha qo'zg'atuvchilarni to'liq yo'q qilishdir. Yakuniy dezinfeksiya odatda dezinfeksiya stansiyasi yoki tegishli xizmatning maxsus brigadasi tomonidan, zararsizlantirish kamerasi va kimyoviy vositalardan foydalanib, puxta o'tkaziladi. U xona, barcha buyumlar, mebel va bemor foydalangan narsalarni qamrab oladi. Yakuniy dezinfeksiya ayniqsa tashqi muhitda chidamli qo'zg'atuvchilar (ich terlama, virusli gepatit, sil, kuydirgi) keltirgan o'choqlarda muhimdir [1][2]. Yakuniy dezinfeksiyani o'tkazish zarurati va muddati kasallikning nozologik shakliga bog'liq: tashqi muhitda tez nobud bo'ladigan qo'zg'atuvchilar (masalan, gripp, qizamiq) uchun u ko'pincha talab etilmaydi yoki shamollatish va nam tozalash bilan cheklaniladi, chidamli qo'zg'atuvchilar uchun esa majburiydir. Yakuniy dezinfeksiya imkon qadar tez — manba olib chiqilgach belgilangan qisqa muddat ichida o'tkazilishi kerak, chunki vaqt o'tgan sari qolgan qo'zg'atuvchining yangi odamga yuqish xavfi ortadi.</w:t>
+        <w:t xml:space="preserve">Yakuniy dezinfeksiya infeksiya manbai o'choqdan bartaraf etilgandan keyin — bemor shifoxonaga joylashtirilgach, sog'aygach, ambulator davolanish tugagach yoki o'lim holatida — bir marta o'tkaziladi va o'choqda qolgan patogenlarni to'liq yo'q qilishga qaratiladi [1]. U butun xona, buyumlar, mebel va bemor foydalangan narsalarni qamrab oladi; tashqi muhitda chidamli qo'zg'atuvchilar keltirgan o'choqlarda majburiydir. Yakuniy dezinfeksiyada ajralmalarni zararsizlantirish aniq me'yorlar bo'yicha bajariladi: quruq xlorli ohak 200 g/kg (1:5) nisbatda sepilib 1 soat, gipoxlorid kalsiy esa 100 g/kg (1:10) hisobida 2 soat ushlab turiladi [1]. Kiyim, ko'rpa-to'shak va jihozlar kamerali dezinfeksiya (100–110°C li issiq bug') orqali zararsizlantiriladi [1]. Yakuniy dezinfeksiya belgilangan ketma-ketlikda bajariladi: kirish joyidan boshlab polga eritma purkaladi, bemorning oziq-ovqat qoldiqlari va ajralmalari zararsizlantiriladi, idishlar va yumshoq buyumlar yig'ib ishlov beriladi, jihozlar va devorlar 2 metr balandlikkacha dezinfeksiyalanadi, so'ng oshxona, hammom, hojatxona va yo'lak zararsizlantirilib, o'choqdan chiqishdan oldin pol qayta ishlanadi [1]. O'tkazilgan yakuniy dezinfeksiya ishlari maxsus F.323/U shaklida qayd etiladi [1].</w:t>
       </w:r>
     </w:p>
     <w:p>
@@ -80,7 +80,7 @@
         <w:spacing w:after="80" w:before="160"/>
       </w:pPr>
       <w:r>
-        <w:t xml:space="preserve">Dezinfeksiya usullari</w:t>
+        <w:t xml:space="preserve">O'tkazish usullari</w:t>
       </w:r>
     </w:p>
     <w:p>
@@ -89,7 +89,7 @@
         <w:jc w:val="both"/>
       </w:pPr>
       <w:r>
-        <w:t xml:space="preserve">Dezinfeksiya bir necha usulda o'tkaziladi. Mexanik usul — changyutish, yuvish, shamollatish, iflos qavatni olib tashlash (qo'zg'atuvchi sonini kamaytiradi). Fizik usul — yuqori harorat (qaynatish, bug', quruq issiq havo), ultrabinafsha nurlanish, qizdirish. Kimyoviy usul — dezinfeksiyalovchi moddalar (xlor saqlovchi preparatlar, vodorod peroksid, chetvertichli ammoniy birikmalari, spirtlar) eritmalari bilan ishlov berish; bu eng keng tarqalgan usuldir. Biologik usul esa mikroorganizmlar yoki ularning mahsulotlaridan foydalanishga asoslanadi (asosan chiqindi suvlarni tozalashda). Usulni tanlash qo'zg'atuvchi turi, obyekt xususiyati va qo'zg'atuvchining chidamlilik darajasiga bog'liq [2]. Masalan, vegetativ bakteriyalar nisbatan oson yo'q qilinadi, viruslar turlicha chidamlilikka ega, sporali shakllar (kuydirgi, qoqshol qo'zg'atuvchilari) esa eng chidamli bo'lib, ular faqat kuchli rejimlarda — avtoklavlash yoki yuqori konsentratsiyali vositalar bilan uzoq ekspozitsiyada halok bo'ladi. Shu bois dezinfeksiya rejimini tanlashda qo'zg'atuvchining biologik xususiyatlarini hisobga olish zarur. Noto'g'ri tanlangan preparat yoki yetarli bo'lmagan ekspozitsiya dezinfeksiyani samarasiz qilib, soxta xavfsizlik tuyg'usini keltirib chiqaradi.</w:t>
+        <w:t xml:space="preserve">Dezinfeksiya mexanik, fizik va kimyoviy usullarda o'tkaziladi. Mexanik usul (yuvish, changyutish, shamollatish) qo'zg'atuvchi sonini kamaytiradi, fizik usul (qaynatish, bug', quruq issiq havo, ultrabinafsha nurlanish) va kimyoviy usul (dezinfeksiyalovchi eritmalar) esa qo'zg'atuvchini to'g'ridan-to'g'ri yo'q qiladi [2]. Usulni tanlash qo'zg'atuvchi turi, uning chidamliligi va obyekt xususiyatiga bog'liq [2]. Kimyoviy vosita tanlanganda uning xavf sinfi hisobga olinadi: inson va atrof-muhitga zarar yetkazmaslik uchun kam zaharli, III–IV xavf sinfidagi vositalardan foydalanish nazarda tutiladi [1]. Epidemik o'choqlarda ko'chma (avtotirkamali) dezinfeksiya kameralaridan foydalanish mumkin [1]. Kamerali dezinfeksiya, ayniqsa, yumshoq buyumlar — choyshab, yotoq va ustki kiyimlar, gilam va poyondozlarni zararsizlantirishda qo'llaniladi, chunki ularni eritma bilan to'liq ishlov berish qiyin [1]. Usulni to'g'ri tanlash qo'zg'atuvchining tashqi muhitdagi chidamliligini hisobga olishni talab qiladi: spora hosil qiluvchi qo'zg'atuvchilar uchun eng kuchli rejimlar zarur [2].</w:t>
       </w:r>
     </w:p>
     <w:p>
@@ -98,7 +98,7 @@
         <w:spacing w:after="80" w:before="160"/>
       </w:pPr>
       <w:r>
-        <w:t xml:space="preserve">O'tkazish tartibi va sifat nazorati</w:t>
+        <w:t xml:space="preserve">Samaradorlikni nazorat qilish</w:t>
       </w:r>
     </w:p>
     <w:p>
@@ -107,7 +107,7 @@
         <w:jc w:val="both"/>
       </w:pPr>
       <w:r>
-        <w:t xml:space="preserve">Dezinfeksiya belgilangan tartib-qoidalar asosida o'tkaziladi: to'g'ri preparat va uning kerakli konsentratsiyasini tanlash, ishlov berish vaqti (ekspozitsiya) va usulini saqlash, shaxsiy himoya vositalaridan foydalanish. Dezinfeksiya sifati nazorat qilinadi: vizual nazorat, kimyoviy nazorat (eritma faolligini tekshirish) va bakteriologik nazorat (ishlov berilgan yuzalardan surtma olib, qo'zg'atuvchi qolgan-qolmaganini aniqlash). Bakteriologik nazorat dezinfeksiya samaradorligining eng ishonchli ko'rsatkichidir. Sifat nazorati tadbir haqiqatan maqsadga erishganini tasdiqlaydi [1][2]. Dezinfeksiya tadbirlari hujjatlashtiriladi: o'tkazilgan ish turi, vaqti, ishlatilgan preparat va uning konsentratsiyasi qayd etiladi. Dezinfeksiyalovchi vositalar bilan ishlashda xavfsizlik texnikasiga rioya qilish — ularning ko'pchiligi zaharli va agressiv moddalar bo'lgani uchun — xodim salomatligini himoya qilishning zaruriy shartidir. Shuningdek, vositalarni to'g'ri saqlash, yaroqlilik muddatini nazorat qilish va eritmalarni belgilangan tartibda tayyorlash dezinfeksiyaning samaradorligini va xavfsizligini ta'minlaydi.</w:t>
+        <w:t xml:space="preserve">Dezinfeksiya samaradorligi uch xil nazorat orqali baholanadi: vizual (tozalikni ko'zdan kechirish), kimyoviy (eritmaning faol modda konsentratsiyasini tekshirish) va bakteriologik (ishlov berilgan yuzalardan surtma olib qo'zg'atuvchi qolgan-qolmaganligini aniqlash). Profilaktik dezinfeksiyadan so'ng yuzalardan bakteriologik usulda surtma olinishi va laboratoriya tekshiruvi o'tkazilishi belgilangan [1]. Bakteriologik nazorat samaradorlikning eng ishonchli ko'rsatkichi hisoblanadi [2]. Agar surtmada qo'zg'atuvchi topilsa, dezinfeksiya samarasiz deb baholanadi, sabablari (noto'g'ri konsentratsiya, yetarli bo'lmagan ekspozitsiya) tahlil qilinadi va tadbir qayta o'tkaziladi [2].</w:t>
       </w:r>
     </w:p>
     <w:p>
@@ -116,7 +116,7 @@
         <w:spacing w:after="80" w:before="160"/>
       </w:pPr>
       <w:r>
-        <w:t xml:space="preserve">Xulosa</w:t>
+        <w:t xml:space="preserve">Xavfsizlik va tashkiliy talablar</w:t>
       </w:r>
     </w:p>
     <w:p>
@@ -125,7 +125,25 @@
         <w:jc w:val="both"/>
       </w:pPr>
       <w:r>
-        <w:t xml:space="preserve">Dezinfeksiya tashqi muhitdagi qo'zg'atuvchilarni yo'q qilib, yuqish mexanizmini uzadigan muhim epidemiyaga qarshi tadbirdir. Profilaktik dezinfeksiya manba yo'q joyda rejali ravishda, joriy dezinfeksiya bemor atrofida u manba bo'lib turgan davrda, yakuniy dezinfeksiya esa manba olib chiqilgach bir marta o'tkaziladi. Dezinfeksiya mexanik, fizik, kimyoviy va biologik usullarda amalga oshirilib, uning samaradorligi, xususan bakteriologik nazorat orqali tasdiqlanadi. To'g'ri tashkil etilgan va sifati nazorat qilingan dezinfeksiya ichak infeksiyalari, shifoxona ichi infeksiyalari va boshqa ko'plab kasalliklar tarqalishining oldini olishda hal qiluvchi rol o'ynaydi; shu bois uni o'tkazish tartibini bilish vrach-epidemiolog uchun zaruriy amaliy malakadir.</w:t>
+        <w:t xml:space="preserve">Dezinfeksiyalovchi vositalarning ko'pchiligi zaharli bo'lgani uchun ular bilan ishlashda xavfsizlik qoidalariga rioya qilish shart: xodimlar shaxsiy himoya vositalaridan (qo'lqop, niqob, maxsus kiyim) foydalanadi, eritmalarni to'g'ri konsentratsiyada tayyorlaydi va belgilangan ekspozitsiya vaqtiga amal qiladi; dezinfeksiya tugagach, maxsus kiyimlar (poyabzal, qo'lqop, fartuk, yeng, himoya kiyim) dezinfeksiya qilinadi, tadbirda qatnashganlar esa sanitar ishlovdan o'tadi [1][2]. Vositalar belgilangan tartibda saqlanadi, tashiladi va ulardan foydalaniladi; ularning yaroqlilik muddati nazorat qilinadi [1]. Dezinfeksiya tadbirlari hujjatlashtiriladi va davlat sanitariya nazorati ostida bo'ladi. To'g'ri tanlangan usul va vosita, aniq konsentratsiya hamda ekspozitsiya dezinfeksiya samaradorligining asosiy shartidir [2].</w:t>
+      </w:r>
+    </w:p>
+    <w:p>
+      <w:pPr>
+        <w:pStyle w:val="Heading2"/>
+        <w:spacing w:after="80" w:before="160"/>
+      </w:pPr>
+      <w:r>
+        <w:t xml:space="preserve">Xulosa</w:t>
+      </w:r>
+    </w:p>
+    <w:p>
+      <w:pPr>
+        <w:spacing w:after="120"/>
+        <w:jc w:val="both"/>
+      </w:pPr>
+      <w:r>
+        <w:t xml:space="preserve">Profilaktik dezinfeksiya epidemik vaziyatdan qat'i nazar oldini olish maqsadida muntazam, joriy dezinfeksiya bemor manba bo'lib turgan davrda uzluksiz, yakuniy dezinfeksiya esa manba bartaraf etilgach bir marta o'tkaziladi [1]. Dezinfeksiya mexanik, fizik va kimyoviy usullarda, aniq me'yorlar (konsentratsiya, ekspozitsiya) bo'yicha amalga oshiriladi, vositalarning xavf sinfi hisobga olinadi, samaradorligi esa bakteriologik nazorat bilan tasdiqlanadi [1][2]. To'g'ri tashkil etilgan va nazorat qilingan dezinfeksiya yuqumli kasalliklar tarqalishining oldini olishda hal qiluvchi ahamiyatga ega va vrach-epidemiolog uchun uni to'g'ri rejalashtirish zaruriy kasbiy malakadir.</w:t>
       </w:r>
     </w:p>
     <w:p>
@@ -147,7 +165,7 @@
         <w:spacing w:after="40"/>
       </w:pPr>
       <w:r>
-        <w:t xml:space="preserve">V.L. Osipova. Dezinfeksiya. O'quv qo'llanma. — Moskva: GEOTAR-Media, 2009. (Nusxa: xayrullokomilov.uz/kutubxona, ochiq manba.)</w:t>
+        <w:t xml:space="preserve">SanQvaN 0090-25. Dezinfeksiya tadbirlarini o'tkazish, dezinfeksiya xizmatini amalga oshiruvchi tashkilotlarni joylashtirish hamda ularning xonalari va jihozlariga, dezinfeksiya vositalarini saqlash, tashish va ulardan foydalanishga oid sanitariya qoidalari, normalari va gigiyena normativlari. O'zbekiston Respublikasi SSV huzuridagi Sanitariya-epidemiologik osoyishtalik va jamoat salomatligi qo'mitasining 2025-yil 5-maydagi 8-son qarori; O'zR Adliya vazirligida 2025-yil 3-iyunda ro'yxatga olingan (№ 350). URL: https://lex.uz/docs/-7556121</w:t>
       </w:r>
     </w:p>
     <w:p>
@@ -160,20 +178,7 @@
         <w:spacing w:after="40"/>
       </w:pPr>
       <w:r>
-        <w:t xml:space="preserve">O'zR SanQvaN 0090-25. Dezinfeksiya tadbirlarini o'tkazish, dezinfeksiya xizmatini amalga oshiruvchi tashkilotlarni joylashtirish hamda ularning xonalari va jihozlariga, dezinfeksiya vositalarini saqlash, tashish va ulardan foydalanishga oid sanitariya qoidalari, normalari va gigiyena normativlari. O'zR Adliya vazirligida 2025-yil 3-iyunda ro'yxatga olingan (hisob raqami 350). URL: https://lex.uz/docs/-7556121</w:t>
-      </w:r>
-    </w:p>
-    <w:p>
-      <w:pPr>
-        <w:pStyle w:val="ListParagraph"/>
-        <w:numPr>
-          <w:ilvl w:val="0"/>
-          <w:numId w:val="2"/>
-        </w:numPr>
-        <w:spacing w:after="40"/>
-      </w:pPr>
-      <w:r>
-        <w:t xml:space="preserve">Umumiy epidemiologiya. Oliy tibbiy ta'lim muassasalari uchun darslik. — Toshkent: Tibbiyot nashriyoti.</w:t>
+        <w:t xml:space="preserve">Osipova V.L. Dezinfeksiya: o'quv qo'llanma (tibbiy bilim yurtlari va kollejlar uchun). — Moskva: GEOTAR-Media, 2009. — 136 b.</w:t>
       </w:r>
     </w:p>
     <w:sectPr>

</xml_diff>

<commit_message>
009: sanaladigan matnlar sanoq (ro'yxat) formatiga o'tkazildi
</commit_message>
<xml_diff>
--- a/javoblar/009.docx
+++ b/javoblar/009.docx
@@ -71,88 +71,7 @@
         <w:jc w:val="both"/>
       </w:pPr>
       <w:r>
-        <w:t xml:space="preserve">Yakuniy dezinfeksiya infeksiya manbai o'choqdan bartaraf etilgandan keyin — bemor shifoxonaga joylashtirilgach, sog'aygach, ambulator davolanish tugagach yoki o'lim holatida — bir marta o'tkaziladi va o'choqda qolgan patogenlarni to'liq yo'q qilishga qaratiladi [1]. U butun xona, buyumlar, mebel va bemor foydalangan narsalarni qamrab oladi; tashqi muhitda chidamli qo'zg'atuvchilar keltirgan o'choqlarda majburiydir. Yakuniy dezinfeksiyada ajralmalarni zararsizlantirish aniq me'yorlar bo'yicha bajariladi: quruq xlorli ohak 200 g/kg (1:5) nisbatda sepilib 1 soat, gipoxlorid kalsiy esa 100 g/kg (1:10) hisobida 2 soat ushlab turiladi [1]. Kiyim, ko'rpa-to'shak va jihozlar kamerali dezinfeksiya (100–110°C li issiq bug') orqali zararsizlantiriladi [1]. Yakuniy dezinfeksiya belgilangan ketma-ketlikda bajariladi: kirish joyidan boshlab polga eritma purkaladi, bemorning oziq-ovqat qoldiqlari va ajralmalari zararsizlantiriladi, idishlar va yumshoq buyumlar yig'ib ishlov beriladi, jihozlar va devorlar 2 metr balandlikkacha dezinfeksiyalanadi, so'ng oshxona, hammom, hojatxona va yo'lak zararsizlantirilib, o'choqdan chiqishdan oldin pol qayta ishlanadi [1]. O'tkazilgan yakuniy dezinfeksiya ishlari maxsus F.323/U shaklida qayd etiladi [1].</w:t>
-      </w:r>
-    </w:p>
-    <w:p>
-      <w:pPr>
-        <w:pStyle w:val="Heading2"/>
-        <w:spacing w:after="80" w:before="160"/>
-      </w:pPr>
-      <w:r>
-        <w:t xml:space="preserve">O'tkazish usullari</w:t>
-      </w:r>
-    </w:p>
-    <w:p>
-      <w:pPr>
-        <w:spacing w:after="120"/>
-        <w:jc w:val="both"/>
-      </w:pPr>
-      <w:r>
-        <w:t xml:space="preserve">Dezinfeksiya mexanik, fizik va kimyoviy usullarda o'tkaziladi. Mexanik usul (yuvish, changyutish, shamollatish) qo'zg'atuvchi sonini kamaytiradi, fizik usul (qaynatish, bug', quruq issiq havo, ultrabinafsha nurlanish) va kimyoviy usul (dezinfeksiyalovchi eritmalar) esa qo'zg'atuvchini to'g'ridan-to'g'ri yo'q qiladi [2]. Usulni tanlash qo'zg'atuvchi turi, uning chidamliligi va obyekt xususiyatiga bog'liq [2]. Kimyoviy vosita tanlanganda uning xavf sinfi hisobga olinadi: inson va atrof-muhitga zarar yetkazmaslik uchun kam zaharli, III–IV xavf sinfidagi vositalardan foydalanish nazarda tutiladi [1]. Epidemik o'choqlarda ko'chma (avtotirkamali) dezinfeksiya kameralaridan foydalanish mumkin [1]. Kamerali dezinfeksiya, ayniqsa, yumshoq buyumlar — choyshab, yotoq va ustki kiyimlar, gilam va poyondozlarni zararsizlantirishda qo'llaniladi, chunki ularni eritma bilan to'liq ishlov berish qiyin [1]. Usulni to'g'ri tanlash qo'zg'atuvchining tashqi muhitdagi chidamliligini hisobga olishni talab qiladi: spora hosil qiluvchi qo'zg'atuvchilar uchun eng kuchli rejimlar zarur [2].</w:t>
-      </w:r>
-    </w:p>
-    <w:p>
-      <w:pPr>
-        <w:pStyle w:val="Heading2"/>
-        <w:spacing w:after="80" w:before="160"/>
-      </w:pPr>
-      <w:r>
-        <w:t xml:space="preserve">Samaradorlikni nazorat qilish</w:t>
-      </w:r>
-    </w:p>
-    <w:p>
-      <w:pPr>
-        <w:spacing w:after="120"/>
-        <w:jc w:val="both"/>
-      </w:pPr>
-      <w:r>
-        <w:t xml:space="preserve">Dezinfeksiya samaradorligi uch xil nazorat orqali baholanadi: vizual (tozalikni ko'zdan kechirish), kimyoviy (eritmaning faol modda konsentratsiyasini tekshirish) va bakteriologik (ishlov berilgan yuzalardan surtma olib qo'zg'atuvchi qolgan-qolmaganligini aniqlash). Profilaktik dezinfeksiyadan so'ng yuzalardan bakteriologik usulda surtma olinishi va laboratoriya tekshiruvi o'tkazilishi belgilangan [1]. Bakteriologik nazorat samaradorlikning eng ishonchli ko'rsatkichi hisoblanadi [2]. Agar surtmada qo'zg'atuvchi topilsa, dezinfeksiya samarasiz deb baholanadi, sabablari (noto'g'ri konsentratsiya, yetarli bo'lmagan ekspozitsiya) tahlil qilinadi va tadbir qayta o'tkaziladi [2].</w:t>
-      </w:r>
-    </w:p>
-    <w:p>
-      <w:pPr>
-        <w:pStyle w:val="Heading2"/>
-        <w:spacing w:after="80" w:before="160"/>
-      </w:pPr>
-      <w:r>
-        <w:t xml:space="preserve">Xavfsizlik va tashkiliy talablar</w:t>
-      </w:r>
-    </w:p>
-    <w:p>
-      <w:pPr>
-        <w:spacing w:after="120"/>
-        <w:jc w:val="both"/>
-      </w:pPr>
-      <w:r>
-        <w:t xml:space="preserve">Dezinfeksiyalovchi vositalarning ko'pchiligi zaharli bo'lgani uchun ular bilan ishlashda xavfsizlik qoidalariga rioya qilish shart: xodimlar shaxsiy himoya vositalaridan (qo'lqop, niqob, maxsus kiyim) foydalanadi, eritmalarni to'g'ri konsentratsiyada tayyorlaydi va belgilangan ekspozitsiya vaqtiga amal qiladi; dezinfeksiya tugagach, maxsus kiyimlar (poyabzal, qo'lqop, fartuk, yeng, himoya kiyim) dezinfeksiya qilinadi, tadbirda qatnashganlar esa sanitar ishlovdan o'tadi [1][2]. Vositalar belgilangan tartibda saqlanadi, tashiladi va ulardan foydalaniladi; ularning yaroqlilik muddati nazorat qilinadi [1]. Dezinfeksiya tadbirlari hujjatlashtiriladi va davlat sanitariya nazorati ostida bo'ladi. To'g'ri tanlangan usul va vosita, aniq konsentratsiya hamda ekspozitsiya dezinfeksiya samaradorligining asosiy shartidir [2].</w:t>
-      </w:r>
-    </w:p>
-    <w:p>
-      <w:pPr>
-        <w:pStyle w:val="Heading2"/>
-        <w:spacing w:after="80" w:before="160"/>
-      </w:pPr>
-      <w:r>
-        <w:t xml:space="preserve">Xulosa</w:t>
-      </w:r>
-    </w:p>
-    <w:p>
-      <w:pPr>
-        <w:spacing w:after="120"/>
-        <w:jc w:val="both"/>
-      </w:pPr>
-      <w:r>
-        <w:t xml:space="preserve">Profilaktik dezinfeksiya epidemik vaziyatdan qat'i nazar oldini olish maqsadida muntazam, joriy dezinfeksiya bemor manba bo'lib turgan davrda uzluksiz, yakuniy dezinfeksiya esa manba bartaraf etilgach bir marta o'tkaziladi [1]. Dezinfeksiya mexanik, fizik va kimyoviy usullarda, aniq me'yorlar (konsentratsiya, ekspozitsiya) bo'yicha amalga oshiriladi, vositalarning xavf sinfi hisobga olinadi, samaradorligi esa bakteriologik nazorat bilan tasdiqlanadi [1][2]. To'g'ri tashkil etilgan va nazorat qilingan dezinfeksiya yuqumli kasalliklar tarqalishining oldini olishda hal qiluvchi ahamiyatga ega va vrach-epidemiolog uchun uni to'g'ri rejalashtirish zaruriy kasbiy malakadir.</w:t>
-      </w:r>
-    </w:p>
-    <w:p>
-      <w:pPr>
-        <w:pStyle w:val="Heading2"/>
-        <w:spacing w:after="80" w:before="220"/>
-      </w:pPr>
-      <w:r>
-        <w:t xml:space="preserve">Foydalanilgan adabiyotlar</w:t>
+        <w:t xml:space="preserve">Yakuniy dezinfeksiya infeksiya manbai o'choqdan bartaraf etilgandan keyin — bemor shifoxonaga joylashtirilgach, sog'aygach, ambulator davolanish tugagach yoki o'lim holatida — bir marta o'tkaziladi va o'choqda qolgan patogenlarni to'liq yo'q qilishga qaratiladi [1]. U butun xona, buyumlar, mebel va bemor foydalangan narsalarni qamrab oladi; tashqi muhitda chidamli qo'zg'atuvchilar keltirgan o'choqlarda majburiydir. Yakuniy dezinfeksiyada ajralmalarni zararsizlantirish aniq me'yorlar bo'yicha bajariladi: quruq xlorli ohak 200 g/kg (1:5) nisbatda sepilib 1 soat, gipoxlorid kalsiy esa 100 g/kg (1:10) hisobida 2 soat ushlab turiladi [1]. Kiyim, ko'rpa-to'shak va jihozlar kamerali dezinfeksiya (100–110°C li issiq bug') orqali zararsizlantiriladi [1]. Yakuniy dezinfeksiya quyidagi ketma-ketlikda bajariladi [1]:</w:t>
       </w:r>
     </w:p>
     <w:p>
@@ -165,7 +84,7 @@
         <w:spacing w:after="40"/>
       </w:pPr>
       <w:r>
-        <w:t xml:space="preserve">SanQvaN 0090-25. Dezinfeksiya tadbirlarini o'tkazish, dezinfeksiya xizmatini amalga oshiruvchi tashkilotlarni joylashtirish hamda ularning xonalari va jihozlariga, dezinfeksiya vositalarini saqlash, tashish va ulardan foydalanishga oid sanitariya qoidalari, normalari va gigiyena normativlari. O'zbekiston Respublikasi SSV huzuridagi Sanitariya-epidemiologik osoyishtalik va jamoat salomatligi qo'mitasining 2025-yil 5-maydagi 8-son qarori; O'zR Adliya vazirligida 2025-yil 3-iyunda ro'yxatga olingan (№ 350). URL: https://lex.uz/docs/-7556121</w:t>
+        <w:t xml:space="preserve">kirish joyidan boshlab polga dezinfeksiyalovchi eritma purkaladi;</w:t>
       </w:r>
     </w:p>
     <w:p>
@@ -174,6 +93,235 @@
         <w:numPr>
           <w:ilvl w:val="0"/>
           <w:numId w:val="2"/>
+        </w:numPr>
+        <w:spacing w:after="40"/>
+      </w:pPr>
+      <w:r>
+        <w:t xml:space="preserve">bemorning oziq-ovqat qoldiqlari va ajralmalari zararsizlantiriladi;</w:t>
+      </w:r>
+    </w:p>
+    <w:p>
+      <w:pPr>
+        <w:pStyle w:val="ListParagraph"/>
+        <w:numPr>
+          <w:ilvl w:val="0"/>
+          <w:numId w:val="2"/>
+        </w:numPr>
+        <w:spacing w:after="40"/>
+      </w:pPr>
+      <w:r>
+        <w:t xml:space="preserve">barcha idishlar yig'ilib, qopqoqli idishda ishlov beriladi;</w:t>
+      </w:r>
+    </w:p>
+    <w:p>
+      <w:pPr>
+        <w:pStyle w:val="ListParagraph"/>
+        <w:numPr>
+          <w:ilvl w:val="0"/>
+          <w:numId w:val="2"/>
+        </w:numPr>
+        <w:spacing w:after="40"/>
+      </w:pPr>
+      <w:r>
+        <w:t xml:space="preserve">yumshoq buyumlar kamerali dezinfeksiya uchun yig'iladi;</w:t>
+      </w:r>
+    </w:p>
+    <w:p>
+      <w:pPr>
+        <w:pStyle w:val="ListParagraph"/>
+        <w:numPr>
+          <w:ilvl w:val="0"/>
+          <w:numId w:val="2"/>
+        </w:numPr>
+        <w:spacing w:after="40"/>
+      </w:pPr>
+      <w:r>
+        <w:t xml:space="preserve">jihozlar va devorlar 2 metr balandlikkacha eritma bilan zararsizlantiriladi;</w:t>
+      </w:r>
+    </w:p>
+    <w:p>
+      <w:pPr>
+        <w:pStyle w:val="ListParagraph"/>
+        <w:numPr>
+          <w:ilvl w:val="0"/>
+          <w:numId w:val="2"/>
+        </w:numPr>
+        <w:spacing w:after="40"/>
+      </w:pPr>
+      <w:r>
+        <w:t xml:space="preserve">oshxona, hammom, hojatxona va yo'lak zararsizlantiriladi;</w:t>
+      </w:r>
+    </w:p>
+    <w:p>
+      <w:pPr>
+        <w:pStyle w:val="ListParagraph"/>
+        <w:numPr>
+          <w:ilvl w:val="0"/>
+          <w:numId w:val="2"/>
+        </w:numPr>
+        <w:spacing w:after="40"/>
+      </w:pPr>
+      <w:r>
+        <w:t xml:space="preserve">o'choqdan chiqishdan oldin pol qayta dezinfeksiyalanadi.</w:t>
+      </w:r>
+    </w:p>
+    <w:p>
+      <w:pPr>
+        <w:spacing w:after="120"/>
+        <w:jc w:val="both"/>
+      </w:pPr>
+      <w:r>
+        <w:t xml:space="preserve">O'tkazilgan yakuniy dezinfeksiya ishlari maxsus F.323/U shaklida qayd etiladi [1].</w:t>
+      </w:r>
+    </w:p>
+    <w:p>
+      <w:pPr>
+        <w:pStyle w:val="Heading2"/>
+        <w:spacing w:after="80" w:before="160"/>
+      </w:pPr>
+      <w:r>
+        <w:t xml:space="preserve">O'tkazish usullari</w:t>
+      </w:r>
+    </w:p>
+    <w:p>
+      <w:pPr>
+        <w:spacing w:after="120"/>
+        <w:jc w:val="both"/>
+      </w:pPr>
+      <w:r>
+        <w:t xml:space="preserve">Dezinfeksiya o'tkazish usuliga ko'ra uch guruhga bo'linadi [2]:</w:t>
+      </w:r>
+    </w:p>
+    <w:p>
+      <w:pPr>
+        <w:pStyle w:val="ListParagraph"/>
+        <w:numPr>
+          <w:ilvl w:val="0"/>
+          <w:numId w:val="3"/>
+        </w:numPr>
+        <w:spacing w:after="40"/>
+      </w:pPr>
+      <w:r>
+        <w:t xml:space="preserve">mexanik usul — yuvish, changyutish, shamollatish, iflos qatlamni olib tashlash; qo'zg'atuvchi sonini kamaytiradi;</w:t>
+      </w:r>
+    </w:p>
+    <w:p>
+      <w:pPr>
+        <w:pStyle w:val="ListParagraph"/>
+        <w:numPr>
+          <w:ilvl w:val="0"/>
+          <w:numId w:val="3"/>
+        </w:numPr>
+        <w:spacing w:after="40"/>
+      </w:pPr>
+      <w:r>
+        <w:t xml:space="preserve">fizik usul — qaynatish, bug', quruq issiq havo, ultrabinafsha nurlanish; yuqori harorat qo'zg'atuvchini halok qiladi;</w:t>
+      </w:r>
+    </w:p>
+    <w:p>
+      <w:pPr>
+        <w:pStyle w:val="ListParagraph"/>
+        <w:numPr>
+          <w:ilvl w:val="0"/>
+          <w:numId w:val="3"/>
+        </w:numPr>
+        <w:spacing w:after="40"/>
+      </w:pPr>
+      <w:r>
+        <w:t xml:space="preserve">kimyoviy usul — dezinfeksiyalovchi eritmalar bilan ishlov berish; eng keng tarqalgan usul.</w:t>
+      </w:r>
+    </w:p>
+    <w:p>
+      <w:pPr>
+        <w:spacing w:after="120"/>
+        <w:jc w:val="both"/>
+      </w:pPr>
+      <w:r>
+        <w:t xml:space="preserve">Usulni tanlash qo'zg'atuvchi turi, uning chidamliligi va obyekt xususiyatiga bog'liq; spora hosil qiluvchi qo'zg'atuvchilar uchun eng kuchli rejimlar zarur [2]. Kimyoviy vosita tanlanganda uning xavf sinfi hisobga olinadi: inson va atrof-muhitga zarar yetkazmaslik uchun kam zaharli, III–IV xavf sinfidagi vositalardan foydalanish nazarda tutiladi [1]. Epidemik o'choqlarda ko'chma (avtotirkamali) dezinfeksiya kameralaridan foydalanish mumkin; kamerali dezinfeksiya, ayniqsa, yumshoq buyumlarni (choyshab, yotoq va ustki kiyim, gilam) zararsizlantirishda qo'llaniladi [1].</w:t>
+      </w:r>
+    </w:p>
+    <w:p>
+      <w:pPr>
+        <w:pStyle w:val="Heading2"/>
+        <w:spacing w:after="80" w:before="160"/>
+      </w:pPr>
+      <w:r>
+        <w:t xml:space="preserve">Samaradorlikni nazorat qilish</w:t>
+      </w:r>
+    </w:p>
+    <w:p>
+      <w:pPr>
+        <w:spacing w:after="120"/>
+        <w:jc w:val="both"/>
+      </w:pPr>
+      <w:r>
+        <w:t xml:space="preserve">Dezinfeksiya samaradorligi uch xil nazorat orqali baholanadi: vizual (tozalikni ko'zdan kechirish), kimyoviy (eritmaning faol modda konsentratsiyasini tekshirish) va bakteriologik (ishlov berilgan yuzalardan surtma olib qo'zg'atuvchi qolgan-qolmaganligini aniqlash). Profilaktik dezinfeksiyadan so'ng yuzalardan bakteriologik usulda surtma olinishi va laboratoriya tekshiruvi o'tkazilishi belgilangan [1]. Bakteriologik nazorat samaradorlikning eng ishonchli ko'rsatkichi hisoblanadi [2]. Agar surtmada qo'zg'atuvchi topilsa, dezinfeksiya samarasiz deb baholanadi, sabablari (noto'g'ri konsentratsiya, yetarli bo'lmagan ekspozitsiya) tahlil qilinadi va tadbir qayta o'tkaziladi [2].</w:t>
+      </w:r>
+    </w:p>
+    <w:p>
+      <w:pPr>
+        <w:pStyle w:val="Heading2"/>
+        <w:spacing w:after="80" w:before="160"/>
+      </w:pPr>
+      <w:r>
+        <w:t xml:space="preserve">Xavfsizlik va tashkiliy talablar</w:t>
+      </w:r>
+    </w:p>
+    <w:p>
+      <w:pPr>
+        <w:spacing w:after="120"/>
+        <w:jc w:val="both"/>
+      </w:pPr>
+      <w:r>
+        <w:t xml:space="preserve">Dezinfeksiyalovchi vositalarning ko'pchiligi zaharli bo'lgani uchun ular bilan ishlashda xavfsizlik qoidalariga rioya qilish shart: xodimlar shaxsiy himoya vositalaridan (qo'lqop, niqob, maxsus kiyim) foydalanadi, eritmalarni to'g'ri konsentratsiyada tayyorlaydi va belgilangan ekspozitsiya vaqtiga amal qiladi; dezinfeksiya tugagach, maxsus kiyimlar (poyabzal, qo'lqop, fartuk, yeng, himoya kiyim) dezinfeksiya qilinadi, tadbirda qatnashganlar esa sanitar ishlovdan o'tadi [1][2]. Vositalar belgilangan tartibda saqlanadi, tashiladi va ulardan foydalaniladi; ularning yaroqlilik muddati nazorat qilinadi [1]. Dezinfeksiya tadbirlari hujjatlashtiriladi va davlat sanitariya nazorati ostida bo'ladi. To'g'ri tanlangan usul va vosita, aniq konsentratsiya hamda ekspozitsiya dezinfeksiya samaradorligining asosiy shartidir [2].</w:t>
+      </w:r>
+    </w:p>
+    <w:p>
+      <w:pPr>
+        <w:pStyle w:val="Heading2"/>
+        <w:spacing w:after="80" w:before="160"/>
+      </w:pPr>
+      <w:r>
+        <w:t xml:space="preserve">Xulosa</w:t>
+      </w:r>
+    </w:p>
+    <w:p>
+      <w:pPr>
+        <w:spacing w:after="120"/>
+        <w:jc w:val="both"/>
+      </w:pPr>
+      <w:r>
+        <w:t xml:space="preserve">Profilaktik dezinfeksiya epidemik vaziyatdan qat'i nazar oldini olish maqsadida muntazam, joriy dezinfeksiya bemor manba bo'lib turgan davrda uzluksiz, yakuniy dezinfeksiya esa manba bartaraf etilgach bir marta o'tkaziladi [1]. Dezinfeksiya mexanik, fizik va kimyoviy usullarda, aniq me'yorlar (konsentratsiya, ekspozitsiya) bo'yicha amalga oshiriladi, vositalarning xavf sinfi hisobga olinadi, samaradorligi esa bakteriologik nazorat bilan tasdiqlanadi [1][2]. To'g'ri tashkil etilgan va nazorat qilingan dezinfeksiya yuqumli kasalliklar tarqalishining oldini olishda hal qiluvchi ahamiyatga ega va vrach-epidemiolog uchun uni to'g'ri rejalashtirish zaruriy kasbiy malakadir.</w:t>
+      </w:r>
+    </w:p>
+    <w:p>
+      <w:pPr>
+        <w:pStyle w:val="Heading2"/>
+        <w:spacing w:after="80" w:before="220"/>
+      </w:pPr>
+      <w:r>
+        <w:t xml:space="preserve">Foydalanilgan adabiyotlar</w:t>
+      </w:r>
+    </w:p>
+    <w:p>
+      <w:pPr>
+        <w:pStyle w:val="ListParagraph"/>
+        <w:numPr>
+          <w:ilvl w:val="0"/>
+          <w:numId w:val="4"/>
+        </w:numPr>
+        <w:spacing w:after="40"/>
+      </w:pPr>
+      <w:r>
+        <w:t xml:space="preserve">SanQvaN 0090-25. Dezinfeksiya tadbirlarini o'tkazish, dezinfeksiya xizmatini amalga oshiruvchi tashkilotlarni joylashtirish hamda ularning xonalari va jihozlariga, dezinfeksiya vositalarini saqlash, tashish va ulardan foydalanishga oid sanitariya qoidalari, normalari va gigiyena normativlari. O'zbekiston Respublikasi SSV huzuridagi Sanitariya-epidemiologik osoyishtalik va jamoat salomatligi qo'mitasining 2025-yil 5-maydagi 8-son qarori; O'zR Adliya vazirligida 2025-yil 3-iyunda ro'yxatga olingan (№ 350). URL: https://lex.uz/docs/-7556121</w:t>
+      </w:r>
+    </w:p>
+    <w:p>
+      <w:pPr>
+        <w:pStyle w:val="ListParagraph"/>
+        <w:numPr>
+          <w:ilvl w:val="0"/>
+          <w:numId w:val="4"/>
         </w:numPr>
         <w:spacing w:after="40"/>
       </w:pPr>
@@ -394,6 +542,18 @@
     </w:lvlOverride>
   </w:num>
   <w:num w:numId="2">
+    <w:abstractNumId w:val="3"/>
+    <w:lvlOverride w:ilvl="0">
+      <w:startOverride w:val="1"/>
+    </w:lvlOverride>
+  </w:num>
+  <w:num w:numId="3">
+    <w:abstractNumId w:val="2"/>
+    <w:lvlOverride w:ilvl="0">
+      <w:startOverride w:val="1"/>
+    </w:lvlOverride>
+  </w:num>
+  <w:num w:numId="4">
     <w:abstractNumId w:val="4"/>
     <w:lvlOverride w:ilvl="0">
       <w:startOverride w:val="1"/>

</xml_diff>